<commit_message>
Agrega plantillas en blanco (Actas, DD, Alcance, Informe), firmas y scripts actualizados; limpia utilidades obsoletas
</commit_message>
<xml_diff>
--- a/templates/ACTA_DE_CERTIFICACIÓN_DE_SUBASTA_ELECTRÓNICA.docx
+++ b/templates/ACTA_DE_CERTIFICACIÓN_DE_SUBASTA_ELECTRÓNICA.docx
@@ -552,19 +552,11 @@
       <w:r>
         <w:t>I</w:t>
       </w:r>
-      <w:proofErr w:type="spellStart"/>
       <w:r>
         <w:rPr>
           <w:lang w:val="es-ES"/>
         </w:rPr>
-        <w:t>nmueble</w:t>
-      </w:r>
-      <w:proofErr w:type="spellEnd"/>
-      <w:r>
-        <w:rPr>
-          <w:lang w:val="es-ES"/>
-        </w:rPr>
-        <w:t xml:space="preserve"> adjudicado: </w:t>
+        <w:t xml:space="preserve">nmueble adjudicado: </w:t>
       </w:r>
       <w:r>
         <w:t>##</w:t>
@@ -743,11 +735,7 @@
         <w:t xml:space="preserve"> </w:t>
       </w:r>
       <w:r>
-        <w:t>##cedula_ganador#</w:t>
-      </w:r>
-      <w:proofErr w:type="gramStart"/>
-      <w:r>
-        <w:t xml:space="preserve"># </w:t>
+        <w:t xml:space="preserve">##cedula_ganador## </w:t>
       </w:r>
       <w:r>
         <w:rPr>
@@ -755,16 +743,7 @@
           <w:szCs w:val="24"/>
           <w:lang w:val="es-ES"/>
         </w:rPr>
-        <w:t>,</w:t>
-      </w:r>
-      <w:proofErr w:type="gramEnd"/>
-      <w:r>
-        <w:rPr>
-          <w:sz w:val="24"/>
-          <w:szCs w:val="24"/>
-          <w:lang w:val="es-ES"/>
-        </w:rPr>
-        <w:t xml:space="preserve"> aportó los siguientes documentos exigidos</w:t>
+        <w:t>, aportó los siguientes documentos exigidos</w:t>
       </w:r>
       <w:r>
         <w:rPr>
@@ -921,25 +900,7 @@
           <w:szCs w:val="24"/>
           <w:lang w:val="es-ES"/>
         </w:rPr>
-        <w:t xml:space="preserve"> deja expresa constancia de que la Subasta Electrónica </w:t>
-      </w:r>
-      <w:proofErr w:type="spellStart"/>
-      <w:r>
-        <w:rPr>
-          <w:sz w:val="24"/>
-          <w:szCs w:val="24"/>
-          <w:lang w:val="es-ES"/>
-        </w:rPr>
-        <w:t>N°</w:t>
-      </w:r>
-      <w:proofErr w:type="spellEnd"/>
-      <w:r>
-        <w:rPr>
-          <w:sz w:val="24"/>
-          <w:szCs w:val="24"/>
-          <w:lang w:val="es-ES"/>
-        </w:rPr>
-        <w:t xml:space="preserve">. </w:t>
+        <w:t xml:space="preserve"> deja expresa constancia de que la Subasta Electrónica N°. </w:t>
       </w:r>
       <w:r>
         <w:rPr>
@@ -1064,10 +1025,10 @@
           <w:szCs w:val="24"/>
         </w:rPr>
         <w:drawing>
-          <wp:inline distT="0" distB="0" distL="0" distR="0" wp14:anchorId="3E838449" wp14:editId="1F813B5C">
-            <wp:extent cx="1391139" cy="602675"/>
-            <wp:effectExtent l="0" t="0" r="6350" b="0"/>
-            <wp:docPr id="1842624472" name="Imagen 1" descr="Forma&#10;&#10;El contenido generado por IA puede ser incorrecto."/>
+          <wp:inline distT="0" distB="0" distL="0" distR="0" wp14:anchorId="1CC791C0" wp14:editId="772A2EBB">
+            <wp:extent cx="1862919" cy="618794"/>
+            <wp:effectExtent l="0" t="0" r="4445" b="0"/>
+            <wp:docPr id="1910869196" name="Imagen 5"/>
             <wp:cNvGraphicFramePr>
               <a:graphicFrameLocks xmlns:a="http://schemas.openxmlformats.org/drawingml/2006/main" noChangeAspect="1"/>
             </wp:cNvGraphicFramePr>
@@ -1075,23 +1036,36 @@
               <a:graphicData uri="http://schemas.openxmlformats.org/drawingml/2006/picture">
                 <pic:pic xmlns:pic="http://schemas.openxmlformats.org/drawingml/2006/picture">
                   <pic:nvPicPr>
-                    <pic:cNvPr id="1842624472" name="Imagen 1" descr="Forma&#10;&#10;El contenido generado por IA puede ser incorrecto."/>
-                    <pic:cNvPicPr/>
+                    <pic:cNvPr id="0" name="Picture 1"/>
+                    <pic:cNvPicPr>
+                      <a:picLocks noChangeAspect="1" noChangeArrowheads="1"/>
+                    </pic:cNvPicPr>
                   </pic:nvPicPr>
                   <pic:blipFill>
-                    <a:blip r:embed="rId10"/>
+                    <a:blip r:embed="rId10" cstate="print">
+                      <a:extLst>
+                        <a:ext uri="{28A0092B-C50C-407E-A947-70E740481C1C}">
+                          <a14:useLocalDpi xmlns:a14="http://schemas.microsoft.com/office/drawing/2010/main" val="0"/>
+                        </a:ext>
+                      </a:extLst>
+                    </a:blip>
+                    <a:srcRect/>
                     <a:stretch>
                       <a:fillRect/>
                     </a:stretch>
                   </pic:blipFill>
-                  <pic:spPr>
+                  <pic:spPr bwMode="auto">
                     <a:xfrm>
                       <a:off x="0" y="0"/>
-                      <a:ext cx="1458258" cy="631752"/>
+                      <a:ext cx="1889298" cy="627556"/>
                     </a:xfrm>
                     <a:prstGeom prst="rect">
                       <a:avLst/>
                     </a:prstGeom>
+                    <a:noFill/>
+                    <a:ln>
+                      <a:noFill/>
+                    </a:ln>
                   </pic:spPr>
                 </pic:pic>
               </a:graphicData>
@@ -1113,7 +1087,7 @@
           <w:sz w:val="24"/>
           <w:szCs w:val="24"/>
         </w:rPr>
-        <w:t>ABRAHAM ANTONIO KATIME ORCASITA</w:t>
+        <w:t>HEIDY CAMACHO NEUTO</w:t>
       </w:r>
     </w:p>
     <w:p>
@@ -1130,7 +1104,7 @@
           <w:sz w:val="24"/>
           <w:szCs w:val="24"/>
         </w:rPr>
-        <w:t>Representante Legal</w:t>
+        <w:t>Apoderada General</w:t>
       </w:r>
     </w:p>
     <w:p>
@@ -1159,10 +1133,10 @@
           <w:szCs w:val="24"/>
         </w:rPr>
         <w:drawing>
-          <wp:inline distT="0" distB="0" distL="0" distR="0" wp14:anchorId="305A24AB" wp14:editId="1637D461">
-            <wp:extent cx="1390650" cy="462606"/>
-            <wp:effectExtent l="0" t="0" r="0" b="0"/>
-            <wp:docPr id="1350642048" name="Imagen 1"/>
+          <wp:inline distT="0" distB="0" distL="0" distR="0" wp14:anchorId="7D6F41A2" wp14:editId="3FF00CDC">
+            <wp:extent cx="1992573" cy="664116"/>
+            <wp:effectExtent l="0" t="0" r="8255" b="3175"/>
+            <wp:docPr id="1149607476" name="Imagen 6"/>
             <wp:cNvGraphicFramePr>
               <a:graphicFrameLocks xmlns:a="http://schemas.openxmlformats.org/drawingml/2006/main" noChangeAspect="1"/>
             </wp:cNvGraphicFramePr>
@@ -1170,23 +1144,36 @@
               <a:graphicData uri="http://schemas.openxmlformats.org/drawingml/2006/picture">
                 <pic:pic xmlns:pic="http://schemas.openxmlformats.org/drawingml/2006/picture">
                   <pic:nvPicPr>
-                    <pic:cNvPr id="1350642048" name=""/>
-                    <pic:cNvPicPr/>
+                    <pic:cNvPr id="0" name="Picture 2"/>
+                    <pic:cNvPicPr>
+                      <a:picLocks noChangeAspect="1" noChangeArrowheads="1"/>
+                    </pic:cNvPicPr>
                   </pic:nvPicPr>
                   <pic:blipFill>
-                    <a:blip r:embed="rId11"/>
+                    <a:blip r:embed="rId11" cstate="print">
+                      <a:extLst>
+                        <a:ext uri="{28A0092B-C50C-407E-A947-70E740481C1C}">
+                          <a14:useLocalDpi xmlns:a14="http://schemas.microsoft.com/office/drawing/2010/main" val="0"/>
+                        </a:ext>
+                      </a:extLst>
+                    </a:blip>
+                    <a:srcRect/>
                     <a:stretch>
                       <a:fillRect/>
                     </a:stretch>
                   </pic:blipFill>
-                  <pic:spPr>
+                  <pic:spPr bwMode="auto">
                     <a:xfrm>
                       <a:off x="0" y="0"/>
-                      <a:ext cx="1498968" cy="498638"/>
+                      <a:ext cx="2067090" cy="688952"/>
                     </a:xfrm>
                     <a:prstGeom prst="rect">
                       <a:avLst/>
                     </a:prstGeom>
+                    <a:noFill/>
+                    <a:ln>
+                      <a:noFill/>
+                    </a:ln>
                   </pic:spPr>
                 </pic:pic>
               </a:graphicData>
@@ -1208,14 +1195,7 @@
           <w:sz w:val="24"/>
           <w:szCs w:val="24"/>
         </w:rPr>
-        <w:t>HEIDY CAMACHO NEUTO</w:t>
-      </w:r>
-      <w:r>
-        <w:rPr>
-          <w:sz w:val="24"/>
-          <w:szCs w:val="24"/>
-        </w:rPr>
-        <w:t xml:space="preserve"> </w:t>
+        <w:t>YISEL CASTRO</w:t>
       </w:r>
     </w:p>
     <w:p>
@@ -1234,6 +1214,13 @@
         </w:rPr>
         <w:t>Directora Jurídica</w:t>
       </w:r>
+      <w:r>
+        <w:rPr>
+          <w:sz w:val="24"/>
+          <w:szCs w:val="24"/>
+        </w:rPr>
+        <w:t xml:space="preserve"> (E)</w:t>
+      </w:r>
     </w:p>
     <w:p>
       <w:pPr>
@@ -1247,6 +1234,16 @@
     </w:p>
     <w:p>
       <w:pPr>
+        <w:spacing w:line="276" w:lineRule="auto"/>
+        <w:ind w:left="360"/>
+        <w:rPr>
+          <w:sz w:val="24"/>
+          <w:szCs w:val="24"/>
+        </w:rPr>
+      </w:pPr>
+    </w:p>
+    <w:p>
+      <w:pPr>
         <w:spacing w:after="0" w:line="276" w:lineRule="auto"/>
         <w:ind w:left="360"/>
         <w:rPr>
@@ -1256,92 +1253,10 @@
       </w:pPr>
       <w:r>
         <w:rPr>
-          <w:noProof/>
-          <w:sz w:val="24"/>
-          <w:szCs w:val="24"/>
-        </w:rPr>
-        <w:drawing>
-          <wp:inline distT="0" distB="0" distL="0" distR="0" wp14:anchorId="2255FFCE" wp14:editId="7653DA21">
-            <wp:extent cx="1333872" cy="492369"/>
-            <wp:effectExtent l="0" t="0" r="0" b="3175"/>
-            <wp:docPr id="482098049" name="Imagen 1"/>
-            <wp:cNvGraphicFramePr>
-              <a:graphicFrameLocks xmlns:a="http://schemas.openxmlformats.org/drawingml/2006/main" noChangeAspect="1"/>
-            </wp:cNvGraphicFramePr>
-            <a:graphic xmlns:a="http://schemas.openxmlformats.org/drawingml/2006/main">
-              <a:graphicData uri="http://schemas.openxmlformats.org/drawingml/2006/picture">
-                <pic:pic xmlns:pic="http://schemas.openxmlformats.org/drawingml/2006/picture">
-                  <pic:nvPicPr>
-                    <pic:cNvPr id="482098049" name=""/>
-                    <pic:cNvPicPr/>
-                  </pic:nvPicPr>
-                  <pic:blipFill>
-                    <a:blip r:embed="rId12"/>
-                    <a:stretch>
-                      <a:fillRect/>
-                    </a:stretch>
-                  </pic:blipFill>
-                  <pic:spPr>
-                    <a:xfrm>
-                      <a:off x="0" y="0"/>
-                      <a:ext cx="1472522" cy="543548"/>
-                    </a:xfrm>
-                    <a:prstGeom prst="rect">
-                      <a:avLst/>
-                    </a:prstGeom>
-                  </pic:spPr>
-                </pic:pic>
-              </a:graphicData>
-            </a:graphic>
-          </wp:inline>
-        </w:drawing>
-      </w:r>
-      <w:r>
-        <w:rPr>
           <w:sz w:val="24"/>
           <w:szCs w:val="24"/>
         </w:rPr>
         <w:br/>
-      </w:r>
-      <w:r>
-        <w:rPr>
-          <w:b/>
-          <w:bCs/>
-          <w:sz w:val="24"/>
-          <w:szCs w:val="24"/>
-        </w:rPr>
-        <w:t>KEVIN REVEROL PADILLA</w:t>
-      </w:r>
-      <w:r>
-        <w:rPr>
-          <w:sz w:val="24"/>
-          <w:szCs w:val="24"/>
-        </w:rPr>
-        <w:t xml:space="preserve"> </w:t>
-      </w:r>
-    </w:p>
-    <w:p>
-      <w:pPr>
-        <w:spacing w:after="0" w:line="276" w:lineRule="auto"/>
-        <w:ind w:left="360"/>
-        <w:rPr>
-          <w:sz w:val="24"/>
-          <w:szCs w:val="24"/>
-        </w:rPr>
-      </w:pPr>
-      <w:r>
-        <w:rPr>
-          <w:sz w:val="24"/>
-          <w:szCs w:val="24"/>
-        </w:rPr>
-        <w:t>Director Administrativ</w:t>
-      </w:r>
-      <w:r>
-        <w:rPr>
-          <w:sz w:val="24"/>
-          <w:szCs w:val="24"/>
-        </w:rPr>
-        <w:t>o</w:t>
       </w:r>
     </w:p>
     <w:p>
@@ -1385,7 +1300,7 @@
                     <pic:cNvPicPr/>
                   </pic:nvPicPr>
                   <pic:blipFill>
-                    <a:blip r:embed="rId13"/>
+                    <a:blip r:embed="rId12"/>
                     <a:stretch>
                       <a:fillRect/>
                     </a:stretch>
@@ -1494,7 +1409,7 @@
                     <pic:cNvPicPr/>
                   </pic:nvPicPr>
                   <pic:blipFill>
-                    <a:blip r:embed="rId14"/>
+                    <a:blip r:embed="rId13"/>
                     <a:stretch>
                       <a:fillRect/>
                     </a:stretch>
@@ -1559,8 +1474,8 @@
       </w:pPr>
     </w:p>
     <w:sectPr>
-      <w:headerReference w:type="default" r:id="rId15"/>
-      <w:footerReference w:type="default" r:id="rId16"/>
+      <w:headerReference w:type="default" r:id="rId14"/>
+      <w:footerReference w:type="default" r:id="rId15"/>
       <w:pgSz w:w="12240" w:h="15840" w:code="1"/>
       <w:pgMar w:top="1418" w:right="1701" w:bottom="1418" w:left="1701" w:header="709" w:footer="709" w:gutter="0"/>
       <w:cols w:space="708"/>
@@ -8200,11 +8115,12 @@
 </file>
 
 <file path=customXml/item1.xml><?xml version="1.0" encoding="utf-8"?>
-<p:properties xmlns:p="http://schemas.microsoft.com/office/2006/metadata/properties" xmlns:xsi="http://www.w3.org/2001/XMLSchema-instance" xmlns:pc="http://schemas.microsoft.com/office/infopath/2007/PartnerControls">
-  <documentManagement>
-    <_activity xmlns="29f1f09b-9ae1-46b0-bf31-97205a0202f6" xsi:nil="true"/>
-  </documentManagement>
-</p:properties>
+<?mso-contentType ?>
+<FormTemplates xmlns="http://schemas.microsoft.com/sharepoint/v3/contenttype/forms">
+  <Display>DocumentLibraryForm</Display>
+  <Edit>DocumentLibraryForm</Edit>
+  <New>DocumentLibraryForm</New>
+</FormTemplates>
 </file>
 
 <file path=customXml/item2.xml><?xml version="1.0" encoding="utf-8"?>
@@ -8408,20 +8324,17 @@
 </file>
 
 <file path=customXml/item3.xml><?xml version="1.0" encoding="utf-8"?>
-<?mso-contentType ?>
-<FormTemplates xmlns="http://schemas.microsoft.com/sharepoint/v3/contenttype/forms">
-  <Display>DocumentLibraryForm</Display>
-  <Edit>DocumentLibraryForm</Edit>
-  <New>DocumentLibraryForm</New>
-</FormTemplates>
+<p:properties xmlns:p="http://schemas.microsoft.com/office/2006/metadata/properties" xmlns:xsi="http://www.w3.org/2001/XMLSchema-instance" xmlns:pc="http://schemas.microsoft.com/office/infopath/2007/PartnerControls">
+  <documentManagement>
+    <_activity xmlns="29f1f09b-9ae1-46b0-bf31-97205a0202f6" xsi:nil="true"/>
+  </documentManagement>
+</p:properties>
 </file>
 
 <file path=customXml/itemProps1.xml><?xml version="1.0" encoding="utf-8"?>
-<ds:datastoreItem xmlns:ds="http://schemas.openxmlformats.org/officeDocument/2006/customXml" ds:itemID="{156A9911-9A69-46DA-B628-9948E68E27CC}">
+<ds:datastoreItem xmlns:ds="http://schemas.openxmlformats.org/officeDocument/2006/customXml" ds:itemID="{6A52E9A6-F5FF-48FE-8842-C758592415DD}">
   <ds:schemaRefs>
-    <ds:schemaRef ds:uri="http://schemas.microsoft.com/office/2006/metadata/properties"/>
-    <ds:schemaRef ds:uri="http://schemas.microsoft.com/office/infopath/2007/PartnerControls"/>
-    <ds:schemaRef ds:uri="29f1f09b-9ae1-46b0-bf31-97205a0202f6"/>
+    <ds:schemaRef ds:uri="http://schemas.microsoft.com/sharepoint/v3/contenttype/forms"/>
   </ds:schemaRefs>
 </ds:datastoreItem>
 </file>
@@ -8445,9 +8358,11 @@
 </file>
 
 <file path=customXml/itemProps3.xml><?xml version="1.0" encoding="utf-8"?>
-<ds:datastoreItem xmlns:ds="http://schemas.openxmlformats.org/officeDocument/2006/customXml" ds:itemID="{6A52E9A6-F5FF-48FE-8842-C758592415DD}">
+<ds:datastoreItem xmlns:ds="http://schemas.openxmlformats.org/officeDocument/2006/customXml" ds:itemID="{156A9911-9A69-46DA-B628-9948E68E27CC}">
   <ds:schemaRefs>
-    <ds:schemaRef ds:uri="http://schemas.microsoft.com/sharepoint/v3/contenttype/forms"/>
+    <ds:schemaRef ds:uri="http://schemas.microsoft.com/office/2006/metadata/properties"/>
+    <ds:schemaRef ds:uri="http://schemas.microsoft.com/office/infopath/2007/PartnerControls"/>
+    <ds:schemaRef ds:uri="29f1f09b-9ae1-46b0-bf31-97205a0202f6"/>
   </ds:schemaRefs>
 </ds:datastoreItem>
 </file>
</xml_diff>